<commit_message>
Add interaction features to Week 4 model tuning
</commit_message>
<xml_diff>
--- a/docs/Week4_Advanced_Model_Tuning_Report.docx
+++ b/docs/Week4_Advanced_Model_Tuning_Report.docx
@@ -426,20 +426,20 @@
         <w:br/>
         <w:t>Excluded categories: {'academic_calendar': 1}</w:t>
         <w:br/>
-        <w:t>Numeric features: ['char_count', 'word_count', 'sentence_count', 'uppercase_ratio', 'digit_ratio', 'attendance_terms', 'exam_terms', 'credit_terms', 'eligibility_terms', 'fee_terms', 'semester_terms']</w:t>
+        <w:t>Numeric features: ['exam_attendance_interaction', 'credit_eligibility_interaction', 'semester_exam_interaction', 'char_count', 'word_count', 'sentence_count', 'uppercase_ratio', 'digit_ratio', 'attendance_terms', 'exam_terms', 'credit_terms', 'eligibility_terms', 'fee_terms', 'semester_terms']</w:t>
         <w:br/>
         <w:br/>
         <w:t>Experiment comparison:</w:t>
         <w:br/>
         <w:t xml:space="preserve">                                   model  accuracy  macro_f1  weighted_f1  best_cv_macro_f1        best_parameters</w:t>
         <w:br/>
-        <w:t xml:space="preserve">                       Majority baseline    0.3750  0.109091     0.204545               NaN                     {}</w:t>
+        <w:t xml:space="preserve">                       Majority baseline     0.375  0.109091     0.204545               NaN                     {}</w:t>
         <w:br/>
-        <w:t>Word TF-IDF Logistic Regression baseline    0.8750  0.876044     0.869368               NaN                     {}</w:t>
+        <w:t>Word TF-IDF Logistic Regression baseline     0.875  0.876044     0.869368               NaN                     {}</w:t>
         <w:br/>
-        <w:t xml:space="preserve">               Tuned Logistic Regression    0.5625  0.545455     0.522727          0.658543 {'classifier__C': 0.1}</w:t>
+        <w:t xml:space="preserve">               Tuned Logistic Regression     0.625  0.638788     0.610227          0.614603 {'classifier__C': 0.1}</w:t>
         <w:br/>
-        <w:t xml:space="preserve">                        Tuned Linear SVM    0.5625  0.545455     0.522727          0.746821 {'classifier__C': 0.1}</w:t>
+        <w:t xml:space="preserve">                        Tuned Linear SVM     0.625  0.638788     0.610227          0.595051 {'classifier__C': 0.1}</w:t>
         <w:br/>
         <w:br/>
         <w:t>Interpretation and limitations:</w:t>

</xml_diff>

<commit_message>
Correct Week 4 report with latest experiment results
</commit_message>
<xml_diff>
--- a/docs/Week4_Advanced_Model_Tuning_Report.docx
+++ b/docs/Week4_Advanced_Model_Tuning_Report.docx
@@ -250,7 +250,7 @@
           </w:tcPr>
           <w:p>
             <w:r>
-              <w:t>Tuned Logistic Regression</w:t>
+              <w:t>Tuned Logistic Regression + interaction features</w:t>
             </w:r>
           </w:p>
         </w:tc>
@@ -260,7 +260,7 @@
           </w:tcPr>
           <w:p>
             <w:r>
-              <w:t>56.25%</w:t>
+              <w:t>62.50%</w:t>
             </w:r>
           </w:p>
         </w:tc>
@@ -270,7 +270,7 @@
           </w:tcPr>
           <w:p>
             <w:r>
-              <w:t>0.545</w:t>
+              <w:t>0.639</w:t>
             </w:r>
           </w:p>
         </w:tc>
@@ -280,7 +280,7 @@
           </w:tcPr>
           <w:p>
             <w:r>
-              <w:t>0.523</w:t>
+              <w:t>0.610</w:t>
             </w:r>
           </w:p>
         </w:tc>
@@ -292,7 +292,7 @@
           </w:tcPr>
           <w:p>
             <w:r>
-              <w:t>Tuned Linear SVM</w:t>
+              <w:t>Tuned Linear SVM + interaction features</w:t>
             </w:r>
           </w:p>
         </w:tc>
@@ -302,7 +302,7 @@
           </w:tcPr>
           <w:p>
             <w:r>
-              <w:t>56.25%</w:t>
+              <w:t>62.50%</w:t>
             </w:r>
           </w:p>
         </w:tc>
@@ -312,7 +312,7 @@
           </w:tcPr>
           <w:p>
             <w:r>
-              <w:t>0.545</w:t>
+              <w:t>0.639</w:t>
             </w:r>
           </w:p>
         </w:tc>
@@ -322,7 +322,7 @@
           </w:tcPr>
           <w:p>
             <w:r>
-              <w:t>0.523</w:t>
+              <w:t>0.610</w:t>
             </w:r>
           </w:p>
         </w:tc>
@@ -330,7 +330,7 @@
     </w:tbl>
     <w:p>
       <w:r>
-        <w:t>Best cross-validation macro F1 was 0.747 for Linear SVM (C=0.1). Tuned Logistic Regression achieved 0.659 (C=0.1).</w:t>
+        <w:t>After adding interaction features, the best cross-validation macro F1 was 0.615 for Logistic Regression (C=0.1) and 0.595 for Linear SVM (C=0.1).</w:t>
       </w:r>
     </w:p>
     <w:p>

</xml_diff>